<commit_message>
docs: align Sprint 1 acceptance criteria and UAT with current scope
</commit_message>
<xml_diff>
--- a/docs/U3/requirements/task33-story-detail.docx
+++ b/docs/U3/requirements/task33-story-detail.docx
@@ -62,7 +62,7 @@
           <w:rFonts w:ascii="Arial Unicode MS" w:cs="Arial Unicode MS" w:eastAsia="Arial Unicode MS" w:hAnsi="Arial Unicode MS"/>
           <w:rtl w:val="0"/>
         </w:rPr>
-        <w:t xml:space="preserve"> เลือกแนวข้อสอบจากหน้ารายวิชา โดยกรองตามปีการศึกษา ภาคเรียน ช่วงสอบ และผู้สอนที่ระบุไว้ แล้วเปิดอ่านหัวข้อ รูปแบบข้อสอบ และข้อมูลประกอบของรายการที่สนใจ</w:t>
+        <w:t xml:space="preserve"> เลือกแนวข้อสอบจากหน้ารายวิชา โดยกรองตามปีการศึกษา ภาคเรียน และช่วงสอบ แล้วเปิดอ่านหัวข้อ รูปแบบข้อสอบ และข้อมูลประกอบของรายการที่สนใจ</w:t>
       </w:r>
     </w:p>
     <w:p>
@@ -176,7 +176,7 @@
           <w:rFonts w:ascii="Arial Unicode MS" w:cs="Arial Unicode MS" w:eastAsia="Arial Unicode MS" w:hAnsi="Arial Unicode MS"/>
           <w:rtl w:val="0"/>
         </w:rPr>
-        <w:t xml:space="preserve"> นักศึกษาเข้าสู่ระบบแล้ว และ CS261 มีแนวข้อสอบหลายรายการ รวมรายการที่ไม่ระบุผู้สอน</w:t>
+        <w:t xml:space="preserve"> นักศึกษาเข้าสู่ระบบแล้ว และ CS261 มีแนวข้อสอบหลายรายการ รวมรายการที่ไม่ระบุจำนวนข้อหรือคำแนะนำ</w:t>
         <w:br w:type="textWrapping"/>
       </w:r>
       <w:r>
@@ -274,7 +274,7 @@
           <w:rFonts w:ascii="Arial Unicode MS" w:cs="Arial Unicode MS" w:eastAsia="Arial Unicode MS" w:hAnsi="Arial Unicode MS"/>
           <w:rtl w:val="0"/>
         </w:rPr>
-        <w:t xml:space="preserve"> เลือกกรองปีการศึกษา ภาคเรียน ช่วงสอบ หรือผู้สอน ทีละเงื่อนไข</w:t>
+        <w:t xml:space="preserve"> เลือกกรองปีการศึกษา ภาคเรียน หรือช่วงสอบ ทีละเงื่อนไข</w:t>
         <w:br w:type="textWrapping"/>
       </w:r>
       <w:r>
@@ -356,7 +356,7 @@
           <w:rFonts w:ascii="Arial Unicode MS" w:cs="Arial Unicode MS" w:eastAsia="Arial Unicode MS" w:hAnsi="Arial Unicode MS"/>
           <w:rtl w:val="0"/>
         </w:rPr>
-        <w:t xml:space="preserve"> เลือกปี 2568 ภาคเรียน 1 กลางภาค และผู้สอนกลุ่มเรียนที่หนึ่งพร้อมกัน</w:t>
+        <w:t xml:space="preserve"> เลือกปี 2568 ภาคเรียน 1 กลางภาคพร้อมกัน</w:t>
         <w:br w:type="textWrapping"/>
       </w:r>
       <w:r>
@@ -372,7 +372,7 @@
           <w:rFonts w:ascii="Arial Unicode MS" w:cs="Arial Unicode MS" w:eastAsia="Arial Unicode MS" w:hAnsi="Arial Unicode MS"/>
           <w:rtl w:val="0"/>
         </w:rPr>
-        <w:t xml:space="preserve"> พบเฉพาะแนวข้อสอบ CS261 ที่ตรงครบทั้งสี่เงื่อนไข ไม่พบรายการที่ตรงเพียงบางเงื่อนไขหรือแนวข้อสอบวิชาอื่น แม้ข้อมูลการสอบเหมือนกัน</w:t>
+        <w:t xml:space="preserve"> พบเฉพาะแนวข้อสอบ CS261 ที่ตรงครบทั้งสามเงื่อนไข ไม่พบรายการที่ตรงเพียงบางเงื่อนไขหรือแนวข้อสอบวิชาอื่น แม้ข้อมูลการสอบเหมือนกัน</w:t>
       </w:r>
     </w:p>
     <w:p>
@@ -536,7 +536,7 @@
           <w:rFonts w:ascii="Arial Unicode MS" w:cs="Arial Unicode MS" w:eastAsia="Arial Unicode MS" w:hAnsi="Arial Unicode MS"/>
           <w:rtl w:val="0"/>
         </w:rPr>
-        <w:t xml:space="preserve"> อ่านชื่อ วิชา ปี ภาคเรียน ช่วงสอบ หัวข้อ รูปแบบ จำนวนข้อ ผู้สอนและคำแนะนำได้ตรงข้อมูลที่เผยแพร่ การอ่านไม่ให้สิทธิ์ผู้อื่นแก้ไขหรือลบ</w:t>
+        <w:t xml:space="preserve"> อ่านชื่อ วิชา ปี ภาคเรียน ช่วงสอบ หัวข้อ รูปแบบ จำนวนข้อและคำแนะนำได้ตรงข้อมูลที่เผยแพร่ การอ่านไม่ให้สิทธิ์ผู้อื่นแก้ไขหรือลบ</w:t>
       </w:r>
     </w:p>
     <w:p>
@@ -586,7 +586,7 @@
           <w:rFonts w:ascii="Arial Unicode MS" w:cs="Arial Unicode MS" w:eastAsia="Arial Unicode MS" w:hAnsi="Arial Unicode MS"/>
           <w:rtl w:val="0"/>
         </w:rPr>
-        <w:t xml:space="preserve"> นักศึกษาเข้าสู่ระบบแล้ว และแนวข้อสอบไม่ระบุจำนวนข้อ ผู้สอน หรือคำแนะนำ</w:t>
+        <w:t xml:space="preserve"> นักศึกษาเข้าสู่ระบบแล้ว และแนวข้อสอบไม่ระบุจำนวนข้อหรือคำแนะนำ</w:t>
         <w:br w:type="textWrapping"/>
       </w:r>
       <w:r>
@@ -618,7 +618,7 @@
           <w:rFonts w:ascii="Arial Unicode MS" w:cs="Arial Unicode MS" w:eastAsia="Arial Unicode MS" w:hAnsi="Arial Unicode MS"/>
           <w:rtl w:val="0"/>
         </w:rPr>
-        <w:t xml:space="preserve"> อ่านข้อมูลหลักได้ครบ จำนวนข้อและผู้สอนที่ว่างแสดงว่าไม่ระบุ ไม่แทนด้วย 0 หรือข้อมูลสมมติ ส่วนคำแนะนำว่างไม่ทำให้หน้าอ่านผิดพลาด</w:t>
+        <w:t xml:space="preserve"> อ่านข้อมูลหลักได้ครบ จำนวนข้อที่ว่างแสดงว่าไม่ระบุ ไม่แทนด้วย 0 หรือข้อมูลสมมติ ส่วนคำแนะนำว่างไม่ทำให้หน้าอ่านผิดพลาด</w:t>
       </w:r>
     </w:p>
     <w:p>

</xml_diff>